<commit_message>
feat: integrate offer letter generation and verification processes, including new endpoints and UI updates
</commit_message>
<xml_diff>
--- a/frontend/public/course-certificates/Certificates/Airkrit India Offer Letter - Intern - AI-02453 - Template.docx
+++ b/frontend/public/course-certificates/Certificates/Airkrit India Offer Letter - Intern - AI-02453 - Template.docx
@@ -4,19 +4,10 @@
   <w:body>
     <w:p>
       <w:pPr>
-        <w:jc w:val="center"/>
         <w:rPr>
           <w:lang w:val="en-US"/>
         </w:rPr>
       </w:pPr>
-      <w:r>
-        <w:tab/>
-        <w:t xml:space="preserve">              </w:t>
-      </w:r>
-      <w:r>
-        <w:tab/>
-        <w:t xml:space="preserve">           </w:t>
-      </w:r>
     </w:p>
     <w:tbl>
       <w:tblPr>
@@ -53,7 +44,6 @@
                 <w:lang w:val="en-US"/>
               </w:rPr>
             </w:pPr>
-            <w:proofErr w:type="spellStart"/>
             <w:r>
               <w:rPr>
                 <w:rFonts w:ascii="Calibri" w:hAnsi="Calibri" w:cs="Calibri"/>
@@ -63,19 +53,7 @@
                 <w:szCs w:val="28"/>
                 <w:lang w:val="en-US"/>
               </w:rPr>
-              <w:t>Airkrit</w:t>
-            </w:r>
-            <w:proofErr w:type="spellEnd"/>
-            <w:r>
-              <w:rPr>
-                <w:rFonts w:ascii="Calibri" w:hAnsi="Calibri" w:cs="Calibri"/>
-                <w:b/>
-                <w:bCs/>
-                <w:sz w:val="28"/>
-                <w:szCs w:val="28"/>
-                <w:lang w:val="en-US"/>
-              </w:rPr>
-              <w:t xml:space="preserve"> India Pvt. Ltd.</w:t>
+              <w:t>Airkrit India Pvt. Ltd.</w:t>
             </w:r>
           </w:p>
           <w:p>
@@ -198,7 +176,6 @@
               <w:rPr>
                 <w:noProof/>
                 <w:lang w:val="en-US"/>
-                <w14:ligatures w14:val="none"/>
               </w:rPr>
               <w:drawing>
                 <wp:inline distT="0" distB="0" distL="0" distR="0" wp14:anchorId="49216DCA" wp14:editId="227DB048">
@@ -418,7 +395,6 @@
       <w:r>
         <w:t xml:space="preserve">with </w:t>
       </w:r>
-      <w:proofErr w:type="spellStart"/>
       <w:r>
         <w:rPr>
           <w:b/>
@@ -431,15 +407,7 @@
           <w:b/>
           <w:bCs/>
         </w:rPr>
-        <w:t>t</w:t>
-      </w:r>
-      <w:proofErr w:type="spellEnd"/>
-      <w:r>
-        <w:rPr>
-          <w:b/>
-          <w:bCs/>
-        </w:rPr>
-        <w:t xml:space="preserve"> India</w:t>
+        <w:t>t India</w:t>
       </w:r>
       <w:r>
         <w:t xml:space="preserve">. </w:t>
@@ -498,21 +466,7 @@
         <w:rPr>
           <w:b/>
         </w:rPr>
-        <w:t>Your selected Domain (</w:t>
-      </w:r>
-      <w:proofErr w:type="spellStart"/>
-      <w:r>
-        <w:rPr>
-          <w:b/>
-        </w:rPr>
-        <w:t>eg</w:t>
-      </w:r>
-      <w:proofErr w:type="spellEnd"/>
-      <w:r>
-        <w:rPr>
-          <w:b/>
-        </w:rPr>
-        <w:t xml:space="preserve"> Data Analyst)</w:t>
+        <w:t>Your selected Domain (eg Data Analyst)</w:t>
       </w:r>
       <w:r>
         <w:rPr>
@@ -601,6 +555,28 @@
       <w:r>
         <w:t>Congratulations !!</w:t>
       </w:r>
+    </w:p>
+    <w:p>
+      <w:pPr>
+        <w:sectPr>
+          <w:headerReference w:type="even" r:id="rId9"/>
+          <w:headerReference w:type="default" r:id="rId10"/>
+          <w:footerReference w:type="even" r:id="rId11"/>
+          <w:footerReference w:type="default" r:id="rId12"/>
+          <w:headerReference w:type="first" r:id="rId13"/>
+          <w:footerReference w:type="first" r:id="rId14"/>
+          <w:pgSz w:w="11906" w:h="16838"/>
+          <w:pgMar w:top="130" w:right="1133" w:bottom="21" w:left="1440" w:header="708" w:footer="708" w:gutter="0"/>
+          <w:pgBorders w:offsetFrom="page">
+            <w:top w:val="single" w:sz="4" w:space="24" w:color="auto"/>
+            <w:left w:val="single" w:sz="4" w:space="24" w:color="auto"/>
+            <w:bottom w:val="single" w:sz="4" w:space="24" w:color="auto"/>
+            <w:right w:val="single" w:sz="4" w:space="24" w:color="auto"/>
+          </w:pgBorders>
+          <w:cols w:space="708"/>
+          <w:docGrid w:linePitch="360"/>
+        </w:sectPr>
+      </w:pPr>
     </w:p>
     <w:p>
       <w:r>
@@ -623,7 +599,7 @@
                     <pic:cNvPicPr/>
                   </pic:nvPicPr>
                   <pic:blipFill>
-                    <a:blip r:embed="rId9"/>
+                    <a:blip r:embed="rId15"/>
                     <a:stretch>
                       <a:fillRect/>
                     </a:stretch>
@@ -643,10 +619,125 @@
           </wp:inline>
         </w:drawing>
       </w:r>
+      <w:r>
+        <w:t xml:space="preserve"> </w:t>
+      </w:r>
     </w:p>
     <w:p>
       <w:pPr>
         <w:pStyle w:val="NoSpacing"/>
+        <w:jc w:val="right"/>
+        <w:rPr>
+          <w:b/>
+          <w:bCs/>
+        </w:rPr>
+      </w:pPr>
+    </w:p>
+    <w:p>
+      <w:pPr>
+        <w:pStyle w:val="NoSpacing"/>
+        <w:jc w:val="right"/>
+        <w:rPr>
+          <w:b/>
+          <w:bCs/>
+        </w:rPr>
+      </w:pPr>
+    </w:p>
+    <w:p>
+      <w:pPr>
+        <w:pStyle w:val="NoSpacing"/>
+        <w:jc w:val="right"/>
+        <w:rPr>
+          <w:b/>
+          <w:bCs/>
+        </w:rPr>
+      </w:pPr>
+    </w:p>
+    <w:p>
+      <w:pPr>
+        <w:pStyle w:val="NoSpacing"/>
+        <w:jc w:val="right"/>
+        <w:rPr>
+          <w:b/>
+          <w:bCs/>
+        </w:rPr>
+      </w:pPr>
+    </w:p>
+    <w:p>
+      <w:pPr>
+        <w:pStyle w:val="NoSpacing"/>
+        <w:jc w:val="right"/>
+        <w:rPr>
+          <w:b/>
+          <w:bCs/>
+        </w:rPr>
+      </w:pPr>
+    </w:p>
+    <w:p>
+      <w:pPr>
+        <w:pStyle w:val="NoSpacing"/>
+        <w:jc w:val="right"/>
+        <w:rPr>
+          <w:b/>
+          <w:bCs/>
+        </w:rPr>
+      </w:pPr>
+      <w:r>
+        <w:rPr>
+          <w:b/>
+          <w:bCs/>
+        </w:rPr>
+        <w:t>[%qrImage]</w:t>
+      </w:r>
+    </w:p>
+    <w:p>
+      <w:pPr>
+        <w:pStyle w:val="NoSpacing"/>
+        <w:jc w:val="center"/>
+        <w:rPr>
+          <w:b/>
+          <w:bCs/>
+        </w:rPr>
+        <w:sectPr>
+          <w:type w:val="continuous"/>
+          <w:pgSz w:w="11906" w:h="16838"/>
+          <w:pgMar w:top="743" w:right="992" w:bottom="442" w:left="1440" w:header="709" w:footer="709" w:gutter="0"/>
+          <w:pgBorders w:offsetFrom="page">
+            <w:top w:val="single" w:sz="4" w:space="24" w:color="auto"/>
+            <w:left w:val="single" w:sz="4" w:space="24" w:color="auto"/>
+            <w:bottom w:val="single" w:sz="4" w:space="24" w:color="auto"/>
+            <w:right w:val="single" w:sz="4" w:space="24" w:color="auto"/>
+          </w:pgBorders>
+          <w:cols w:num="2" w:space="708"/>
+        </w:sectPr>
+      </w:pPr>
+    </w:p>
+    <w:p>
+      <w:pPr>
+        <w:pStyle w:val="NoSpacing"/>
+        <w:jc w:val="right"/>
+        <w:rPr>
+          <w:b/>
+          <w:bCs/>
+        </w:rPr>
+        <w:sectPr>
+          <w:type w:val="continuous"/>
+          <w:pgSz w:w="11906" w:h="16838"/>
+          <w:pgMar w:top="130" w:right="1133" w:bottom="21" w:left="1440" w:header="708" w:footer="708" w:gutter="0"/>
+          <w:pgBorders w:offsetFrom="page">
+            <w:top w:val="single" w:sz="4" w:space="24" w:color="auto"/>
+            <w:left w:val="single" w:sz="4" w:space="24" w:color="auto"/>
+            <w:bottom w:val="single" w:sz="4" w:space="24" w:color="auto"/>
+            <w:right w:val="single" w:sz="4" w:space="24" w:color="auto"/>
+          </w:pgBorders>
+          <w:cols w:num="2" w:space="708"/>
+          <w:docGrid w:linePitch="360"/>
+        </w:sectPr>
+      </w:pPr>
+    </w:p>
+    <w:p>
+      <w:pPr>
+        <w:pStyle w:val="NoSpacing"/>
         <w:rPr>
           <w:b/>
           <w:bCs/>
@@ -694,15 +785,6 @@
         </w:rPr>
         <w:t>HR</w:t>
       </w:r>
-    </w:p>
-    <w:p>
-      <w:pPr>
-        <w:pStyle w:val="NoSpacing"/>
-        <w:rPr>
-          <w:b/>
-          <w:bCs/>
-        </w:rPr>
-      </w:pPr>
     </w:p>
     <w:p>
       <w:pPr>
@@ -771,7 +853,7 @@
       <w:r>
         <w:t xml:space="preserve">Note : Future verification can be done on </w:t>
       </w:r>
-      <w:hyperlink r:id="rId10" w:history="1">
+      <w:hyperlink r:id="rId16" w:history="1">
         <w:r>
           <w:rPr>
             <w:rStyle w:val="Hyperlink"/>
@@ -781,12 +863,7 @@
       </w:hyperlink>
     </w:p>
     <w:sectPr>
-      <w:headerReference w:type="even" r:id="rId11"/>
-      <w:headerReference w:type="default" r:id="rId12"/>
-      <w:footerReference w:type="even" r:id="rId13"/>
-      <w:footerReference w:type="default" r:id="rId14"/>
-      <w:headerReference w:type="first" r:id="rId15"/>
-      <w:footerReference w:type="first" r:id="rId16"/>
+      <w:type w:val="continuous"/>
       <w:pgSz w:w="11906" w:h="16838"/>
       <w:pgMar w:top="130" w:right="1133" w:bottom="21" w:left="1440" w:header="708" w:footer="708" w:gutter="0"/>
       <w:pgBorders w:offsetFrom="page">
@@ -1405,7 +1482,6 @@
   <w:style w:type="character" w:default="1" w:styleId="DefaultParagraphFont">
     <w:name w:val="Default Paragraph Font"/>
     <w:uiPriority w:val="1"/>
-    <w:semiHidden/>
     <w:unhideWhenUsed/>
   </w:style>
   <w:style w:type="table" w:default="1" w:styleId="TableNormal">

</xml_diff>